<commit_message>
Migra agentes de Anthropic a OpenAI
</commit_message>
<xml_diff>
--- a/docs/01_Guia_del_estudiante.docx
+++ b/docs/01_Guia_del_estudiante.docx
@@ -498,7 +498,7 @@
                 <w:sz w:val="19"/>
                 <w:szCs w:val="19"/>
               </w:rPr>
-              <w:t xml:space="preserve">Python calcula indicadores; Claude los interpreta</w:t>
+              <w:t xml:space="preserve">Python calcula indicadores; OpenAI los interpreta</w:t>
             </w:r>
           </w:p>
         </w:tc>
@@ -2794,7 +2794,7 @@
                 <w:sz w:val="19"/>
                 <w:szCs w:val="19"/>
               </w:rPr>
-              <w:t xml:space="preserve">ANTHROPIC_API_KEY</w:t>
+              <w:t xml:space="preserve">OPENAI_API_KEY</w:t>
             </w:r>
           </w:p>
         </w:tc>
@@ -2821,7 +2821,7 @@
                 <w:sz w:val="19"/>
                 <w:szCs w:val="19"/>
               </w:rPr>
-              <w:t xml:space="preserve">Permite usar a Claude</w:t>
+              <w:t xml:space="preserve">Permite usar OpenAI</w:t>
             </w:r>
           </w:p>
         </w:tc>
@@ -4805,7 +4805,7 @@
           <w:rFonts w:ascii="Consolas" w:cs="Consolas" w:eastAsia="Consolas" w:hAnsi="Consolas"/>
           <w:color w:val="0E6F7A"/>
         </w:rPr>
-        <w:t xml:space="preserve">ANTHROPIC_API_KEY</w:t>
+        <w:t xml:space="preserve">OPENAI_API_KEY</w:t>
       </w:r>
       <w:r>
         <w:t xml:space="preserve">, </w:t>
@@ -7609,7 +7609,7 @@
                 <w:sz w:val="19"/>
                 <w:szCs w:val="19"/>
               </w:rPr>
-              <w:t xml:space="preserve">Error de la API de Claude</w:t>
+              <w:t xml:space="preserve">Error de la API de OpenAI</w:t>
             </w:r>
           </w:p>
         </w:tc>
@@ -7861,14 +7861,14 @@
         <w:spacing w:after="60"/>
       </w:pPr>
       <w:r>
-        <w:t xml:space="preserve">Claude Platform Docs, MCP connector: </w:t>
+        <w:t xml:space="preserve">OpenAI API Docs, MCP servers: </w:t>
       </w:r>
       <w:hyperlink w:history="1" r:id="rIdiiesmxdvuj57zsflxzji-">
         <w:r>
           <w:rPr>
             <w:rStyle w:val="Hyperlink"/>
           </w:rPr>
-          <w:t xml:space="preserve">https://platform.claude.com/docs/en/agents-and-tools/mcp-connector</w:t>
+          <w:t xml:space="preserve">https://developers.openai.com/api/docs/guides/tools-connectors-mcp</w:t>
         </w:r>
       </w:hyperlink>
     </w:p>
@@ -8092,6 +8092,7 @@
     </w:p>
     <w:sectPr>
       <w:footerReference w:type="default" r:id="rId7"/>
+      <w:headerReference w:type="default" r:id="rId8"/>
       <w:pgSz w:w="12240" w:h="15840" w:orient="portrait"/>
       <w:pgMar w:top="1440" w:right="1440" w:bottom="1300" w:left="1440" w:header="708" w:footer="708" w:gutter="0"/>
       <w:pgNumType/>
@@ -8206,6 +8207,16 @@
     </w:p>
   </w:footnote>
 </w:footnotes>
+</file>
+
+<file path=word/header1.xml><?xml version="1.0" encoding="utf-8"?>
+<w:hdr xmlns:m="http://schemas.openxmlformats.org/officeDocument/2006/math" xmlns:mc="http://schemas.openxmlformats.org/markup-compatibility/2006" xmlns:mo="http://schemas.microsoft.com/office/mac/office/2008/main" xmlns:mv="urn:schemas-microsoft-com:mac:vml" xmlns:o="urn:schemas-microsoft-com:office:office" xmlns:r="http://schemas.openxmlformats.org/officeDocument/2006/relationships" xmlns:v="urn:schemas-microsoft-com:vml" xmlns:w10="urn:schemas-microsoft-com:office:word" xmlns:w14="http://schemas.microsoft.com/office/word/2010/wordml" xmlns:w="http://schemas.openxmlformats.org/wordprocessingml/2006/main" xmlns:wne="http://schemas.microsoft.com/office/word/2006/wordml" xmlns:wp14="http://schemas.microsoft.com/office/word/2010/wordprocessingDrawing" xmlns:wp="http://schemas.openxmlformats.org/drawingml/2006/wordprocessingDrawing" xmlns:wpc="http://schemas.microsoft.com/office/word/2010/wordprocessingCanvas" xmlns:wpg="http://schemas.microsoft.com/office/word/2010/wordprocessingGroup" xmlns:wpi="http://schemas.microsoft.com/office/word/2010/wordprocessingInk" xmlns:wps="http://schemas.microsoft.com/office/word/2010/wordprocessingShape" mc:Ignorable="w14 wp14">
+  <w:p>
+    <w:pPr>
+      <w:pStyle w:val="Header"/>
+    </w:pPr>
+  </w:p>
+</w:hdr>
 </file>
 
 <file path=word/numbering.xml><?xml version="1.0" encoding="utf-8"?>

</xml_diff>

<commit_message>
Endurece seguridad del ecosistema
</commit_message>
<xml_diff>
--- a/docs/01_Guia_del_estudiante.docx
+++ b/docs/01_Guia_del_estudiante.docx
@@ -2794,7 +2794,7 @@
                 <w:sz w:val="19"/>
                 <w:szCs w:val="19"/>
               </w:rPr>
-              <w:t xml:space="preserve">OPENAI_API_KEY</w:t>
+              <w:t>OPEN_API_KEY</w:t>
             </w:r>
           </w:p>
         </w:tc>
@@ -3840,11 +3840,7 @@
           </w:tcPr>
           <w:p>
             <w:r>
-              <w:rPr>
-                <w:sz w:val="19"/>
-                <w:szCs w:val="19"/>
-              </w:rPr>
-              <w:t xml:space="preserve">Cada 10 minutos, o al lanzarlo a mano desde el celular</w:t>
+              <w:t>Cada 8 minutos, o al lanzarlo a mano desde el celular</w:t>
             </w:r>
           </w:p>
         </w:tc>
@@ -4606,17 +4602,7 @@
         <w:spacing w:after="120"/>
       </w:pPr>
       <w:r>
-        <w:t xml:space="preserve">GitHub Actions ejecuta el programa en servidores de GitHub. Cada 10 minutos revisa si escribiste </w:t>
-      </w:r>
-      <w:r>
-        <w:rPr>
-          <w:rFonts w:ascii="Consolas" w:cs="Consolas" w:eastAsia="Consolas" w:hAnsi="Consolas"/>
-          <w:color w:val="0E6F7A"/>
-        </w:rPr>
-        <w:t xml:space="preserve">/analiza</w:t>
-      </w:r>
-      <w:r>
-        <w:t xml:space="preserve"> en Telegram, corre la cadena de agentes y te responde. También puedes lanzarlo a mano desde la app de GitHub en tu celular.</w:t>
+        <w:t>GitHub Actions ejecuta el programa en servidores de GitHub. Cada 8 minutos revisa si escribiste /analiza en Telegram, corre la cadena de agentes y te responde. También puedes lanzarlo a mano desde la app de GitHub en tu celular.</w:t>
       </w:r>
     </w:p>
     <w:p>
@@ -4629,15 +4615,7 @@
         <w:ind w:left="120" w:right="120"/>
       </w:pPr>
       <w:r>
-        <w:rPr>
-          <w:b/>
-          <w:bCs/>
-          <w:color w:val="1D4ED8"/>
-        </w:rPr>
-        <w:t xml:space="preserve">💡 </w:t>
-      </w:r>
-      <w:r>
-        <w:t xml:space="preserve">La respuesta no es inmediata: llega en la siguiente revisión, normalmente en 10 a 15 minutos. Telegram guarda tus mensajes hasta 24 horas, así que no se pierden.</w:t>
+        <w:t>💡 La respuesta no es inmediata: llega en la siguiente revisión, normalmente en 1 a 12 minutos; GitHub puede tardar más ocasionalmente. Telegram guarda tus mensajes hasta 24 horas, así que no se pierden.</w:t>
       </w:r>
     </w:p>
     <w:p>
@@ -4778,47 +4756,7 @@
         <w:spacing w:after="80"/>
       </w:pPr>
       <w:r>
-        <w:t xml:space="preserve">Crea los cuatro secretos con los nombres exactos: </w:t>
-      </w:r>
-      <w:r>
-        <w:rPr>
-          <w:rFonts w:ascii="Consolas" w:cs="Consolas" w:eastAsia="Consolas" w:hAnsi="Consolas"/>
-          <w:color w:val="0E6F7A"/>
-        </w:rPr>
-        <w:t xml:space="preserve">TELEGRAM_BOT_TOKEN</w:t>
-      </w:r>
-      <w:r>
-        <w:t xml:space="preserve">, </w:t>
-      </w:r>
-      <w:r>
-        <w:rPr>
-          <w:rFonts w:ascii="Consolas" w:cs="Consolas" w:eastAsia="Consolas" w:hAnsi="Consolas"/>
-          <w:color w:val="0E6F7A"/>
-        </w:rPr>
-        <w:t xml:space="preserve">TELEGRAM_CHAT_ID</w:t>
-      </w:r>
-      <w:r>
-        <w:t xml:space="preserve">, </w:t>
-      </w:r>
-      <w:r>
-        <w:rPr>
-          <w:rFonts w:ascii="Consolas" w:cs="Consolas" w:eastAsia="Consolas" w:hAnsi="Consolas"/>
-          <w:color w:val="0E6F7A"/>
-        </w:rPr>
-        <w:t xml:space="preserve">OPENAI_API_KEY</w:t>
-      </w:r>
-      <w:r>
-        <w:t xml:space="preserve">, </w:t>
-      </w:r>
-      <w:r>
-        <w:rPr>
-          <w:rFonts w:ascii="Consolas" w:cs="Consolas" w:eastAsia="Consolas" w:hAnsi="Consolas"/>
-          <w:color w:val="0E6F7A"/>
-        </w:rPr>
-        <w:t xml:space="preserve">ALPHAVANTAGE_API_KEY</w:t>
-      </w:r>
-      <w:r>
-        <w:t xml:space="preserve">.</w:t>
+        <w:t>Crea los cuatro secretos con los nombres exactos: TELEGRAM_BOT_TOKEN, TELEGRAM_CHAT_ID, OPEN_API_KEY, ALPHAVANTAGE_API_KEY. Por seguridad, si TELEGRAM_CHAT_ID falta o no coincide, el bot no procesa mensajes.</w:t>
       </w:r>
     </w:p>
     <w:p>
@@ -5026,7 +4964,7 @@
         <w:spacing w:after="80"/>
       </w:pPr>
       <w:r>
-        <w:t xml:space="preserve">Espera la siguiente revisión automática (hasta unos 15 minutos).</w:t>
+        <w:t>Espera la siguiente revisión automática (normalmente hasta unos 12 minutos).</w:t>
       </w:r>
     </w:p>
     <w:p>
@@ -5487,18 +5425,7 @@
         <w:ind w:left="200" w:right="200"/>
       </w:pPr>
       <w:r>
-        <w:rPr>
-          <w:rFonts w:ascii="Consolas" w:cs="Consolas" w:eastAsia="Consolas" w:hAnsi="Consolas"/>
-          <w:color w:val="E8F6F8"/>
-          <w:sz w:val="19"/>
-          <w:szCs w:val="19"/>
-        </w:rPr>
-        <w:t xml:space="preserve">codex mcp add alphavantage --url "https://mcp.alphavantage.co/mcp?apikey=$ALPHAVANTAGE_API_KEY"</w:t>
-      </w:r>
-    </w:p>
-    <w:p>
-      <w:r>
-        <w:br w:type="page"/>
+        <w:t>codex mcp add alphavantage --url "https://mcp.alphavantage.co/mcp"</w:t>
       </w:r>
     </w:p>
     <w:p>
@@ -6201,13 +6128,7 @@
         <w:ind w:left="200" w:right="200"/>
       </w:pPr>
       <w:r>
-        <w:rPr>
-          <w:rFonts w:ascii="Consolas" w:cs="Consolas" w:eastAsia="Consolas" w:hAnsi="Consolas"/>
-          <w:color w:val="E8F6F8"/>
-          <w:sz w:val="19"/>
-          <w:szCs w:val="19"/>
-        </w:rPr>
-        <w:t xml:space="preserve">pip install -r requirements.txt pytest</w:t>
+        <w:t>pip install -r requirements.lock</w:t>
       </w:r>
     </w:p>
     <w:p>
@@ -7234,7 +7155,7 @@
                 <w:sz w:val="19"/>
                 <w:szCs w:val="19"/>
               </w:rPr>
-              <w:t xml:space="preserve">“Este bot es privado.”</w:t>
+              <w:t>El bot no responde a ese chat</w:t>
             </w:r>
           </w:p>
         </w:tc>
@@ -7574,11 +7495,7 @@
           </w:tcPr>
           <w:p>
             <w:r>
-              <w:rPr>
-                <w:sz w:val="19"/>
-                <w:szCs w:val="19"/>
-              </w:rPr>
-              <w:t xml:space="preserve">Espera hasta 15 minutos o lanza el workflow a mano</w:t>
+              <w:t>Espera hasta 12 minutos o lanza el workflow a mano</w:t>
             </w:r>
           </w:p>
         </w:tc>

</xml_diff>

<commit_message>
Usa datos gratuitos de Alpha Vantage
</commit_message>
<xml_diff>
--- a/docs/01_Guia_del_estudiante.docx
+++ b/docs/01_Guia_del_estudiante.docx
@@ -412,10 +412,9 @@
           <w:p>
             <w:r>
               <w:rPr>
-                <w:sz w:val="19"/>
-                <w:szCs w:val="19"/>
-              </w:rPr>
-              <w:t xml:space="preserve">Ficha JSON: precio, cambio %, P/E, beta, rango de 52 semanas</w:t>
+                <w:rFonts w:ascii="Times New Roman" w:hAnsi="Times New Roman"/>
+              </w:rPr>
+              <w:t>Ficha JSON: cierre diario, cambio %, OHLCV, SMA 20/50, RSI 14, retorno, volatilidad y volumen</w:t>
             </w:r>
           </w:p>
         </w:tc>
@@ -1854,7 +1853,11 @@
         <w:pStyle w:val="Heading3"/>
       </w:pPr>
       <w:r>
-        <w:t xml:space="preserve">Posición en el rango de 52 semanas</w:t>
+        <w:rPr>
+          <w:rFonts w:ascii="Times New Roman" w:hAnsi="Times New Roman"/>
+          <w:sz w:val="21"/>
+        </w:rPr>
+        <w:t>Indicadores calculados con datos diarios gratuitos</w:t>
       </w:r>
     </w:p>
     <w:p>
@@ -1863,10 +1866,10 @@
       </w:pPr>
       <w:r>
         <w:rPr>
-          <w:b/>
-          <w:bCs/>
-        </w:rPr>
-        <w:t xml:space="preserve">P₅₂ = (Pₜ − P_min) / (P_max − P_min) × 100</w:t>
+          <w:rFonts w:ascii="Times New Roman" w:hAnsi="Times New Roman"/>
+          <w:sz w:val="21"/>
+        </w:rPr>
+        <w:t>Posición₁₀₀ = (Cierre − Mínimo observado) / (Máximo observado − Mínimo observado) × 100</w:t>
       </w:r>
     </w:p>
     <w:p>
@@ -1880,33 +1883,10 @@
       </w:pPr>
       <w:r>
         <w:rPr>
-          <w:b/>
-          <w:bCs/>
-        </w:rPr>
-        <w:t xml:space="preserve">Pₜ</w:t>
-      </w:r>
-      <w:r>
-        <w:t xml:space="preserve">: precio actual (USD). </w:t>
-      </w:r>
-      <w:r>
-        <w:rPr>
-          <w:b/>
-          <w:bCs/>
-        </w:rPr>
-        <w:t xml:space="preserve">P_min</w:t>
-      </w:r>
-      <w:r>
-        <w:t xml:space="preserve"> y </w:t>
-      </w:r>
-      <w:r>
-        <w:rPr>
-          <w:b/>
-          <w:bCs/>
-        </w:rPr>
-        <w:t xml:space="preserve">P_max</w:t>
-      </w:r>
-      <w:r>
-        <w:t xml:space="preserve">: precio mínimo y máximo de las últimas 52 semanas (USD).</w:t>
+          <w:rFonts w:ascii="Times New Roman" w:hAnsi="Times New Roman"/>
+          <w:sz w:val="21"/>
+        </w:rPr>
+        <w:t>El rango usa hasta 100 sesiones de TIME_SERIES_DAILY compact. La apertura, el máximo, el mínimo, el cierre y el volumen provienen de Alpha Vantage.</w:t>
       </w:r>
     </w:p>
     <w:p>
@@ -1920,13 +1900,10 @@
       </w:pPr>
       <w:r>
         <w:rPr>
-          <w:b/>
-          <w:bCs/>
-        </w:rPr>
-        <w:t xml:space="preserve">Resultado</w:t>
-      </w:r>
-      <w:r>
-        <w:t xml:space="preserve">: porcentaje de 0 a 100. Cerca de 100 % el precio está junto a su máximo del año; cerca de 0 %, junto a su mínimo.</w:t>
+          <w:rFonts w:ascii="Times New Roman" w:hAnsi="Times New Roman"/>
+          <w:sz w:val="21"/>
+        </w:rPr>
+        <w:t>El código también calcula SMA 20 y 50, RSI 14, retorno de 20 sesiones, volatilidad histórica anualizada y volumen relativo al promedio de 20 sesiones.</w:t>
       </w:r>
     </w:p>
     <w:p>
@@ -1940,13 +1917,10 @@
       </w:pPr>
       <w:r>
         <w:rPr>
-          <w:b/>
-          <w:bCs/>
-        </w:rPr>
-        <w:t xml:space="preserve">Supuesto</w:t>
-      </w:r>
-      <w:r>
-        <w:t xml:space="preserve">: el máximo es mayor que el mínimo; si falta un dato, el resultado queda vacío (None).</w:t>
+          <w:rFonts w:ascii="Times New Roman" w:hAnsi="Times New Roman"/>
+          <w:sz w:val="21"/>
+        </w:rPr>
+        <w:t>Supuesto: se necesitan suficientes sesiones y valores válidos. Si falta información, el indicador queda vacío (None); la IA no debe completarlo.</w:t>
       </w:r>
     </w:p>
     <w:p>
@@ -1960,23 +1934,10 @@
       </w:pPr>
       <w:r>
         <w:rPr>
-          <w:b/>
-          <w:bCs/>
-        </w:rPr>
-        <w:t xml:space="preserve">Ejemplo</w:t>
-      </w:r>
-      <w:r>
-        <w:t xml:space="preserve">: precio 250.5, mínimo 200, máximo 300 → (250.5 − 200) / (300 − 200) × 100 = </w:t>
-      </w:r>
-      <w:r>
-        <w:rPr>
-          <w:b/>
-          <w:bCs/>
-        </w:rPr>
-        <w:t xml:space="preserve">50.5 %</w:t>
-      </w:r>
-      <w:r>
-        <w:t xml:space="preserve">.</w:t>
+          <w:rFonts w:ascii="Times New Roman" w:hAnsi="Times New Roman"/>
+          <w:sz w:val="21"/>
+        </w:rPr>
+        <w:t>Ejemplo de posición: cierre 150, mínimo 120 y máximo 180 → (150 − 120) / (180 − 120) × 100 = 50.0 %.</w:t>
       </w:r>
     </w:p>
     <w:p>
@@ -1984,7 +1945,11 @@
         <w:pStyle w:val="Heading3"/>
       </w:pPr>
       <w:r>
-        <w:t xml:space="preserve">Semáforo de beta (β)</w:t>
+        <w:rPr>
+          <w:rFonts w:ascii="Times New Roman" w:hAnsi="Times New Roman"/>
+          <w:sz w:val="21"/>
+        </w:rPr>
+        <w:t>Cómo leer las señales</w:t>
       </w:r>
     </w:p>
     <w:p>
@@ -1992,7 +1957,11 @@
         <w:spacing w:after="120"/>
       </w:pPr>
       <w:r>
-        <w:t xml:space="preserve">La beta compara cuánto se mueve la acción frente al mercado. Una beta de 1.3 significa que, en promedio, la acción se mueve un 30 % más que el mercado.</w:t>
+        <w:rPr>
+          <w:rFonts w:ascii="Times New Roman" w:hAnsi="Times New Roman"/>
+          <w:sz w:val="21"/>
+        </w:rPr>
+        <w:t>Las SMA describen tendencia; el RSI 14 muestra impulso; la volatilidad resume cuánto variaron los retornos recientes; el volumen relativo compara la sesión con su promedio de 20 sesiones. Ninguna señal predice por sí sola.</w:t>
       </w:r>
     </w:p>
     <w:tbl>
@@ -2036,13 +2005,9 @@
           <w:p>
             <w:r>
               <w:rPr>
-                <w:b/>
-                <w:bCs/>
-                <w:color w:val="FFFFFF"/>
-                <w:sz w:val="19"/>
-                <w:szCs w:val="19"/>
-              </w:rPr>
-              <w:t xml:space="preserve">Beta</w:t>
+                <w:rFonts w:ascii="Times New Roman" w:hAnsi="Times New Roman"/>
+              </w:rPr>
+              <w:t>RSI 14</w:t>
             </w:r>
           </w:p>
         </w:tc>
@@ -2066,13 +2031,9 @@
           <w:p>
             <w:r>
               <w:rPr>
-                <w:b/>
-                <w:bCs/>
-                <w:color w:val="FFFFFF"/>
-                <w:sz w:val="19"/>
-                <w:szCs w:val="19"/>
-              </w:rPr>
-              <w:t xml:space="preserve">Semáforo</w:t>
+                <w:rFonts w:ascii="Times New Roman" w:hAnsi="Times New Roman"/>
+              </w:rPr>
+              <w:t>Zona</w:t>
             </w:r>
           </w:p>
         </w:tc>
@@ -2096,13 +2057,9 @@
           <w:p>
             <w:r>
               <w:rPr>
-                <w:b/>
-                <w:bCs/>
-                <w:color w:val="FFFFFF"/>
-                <w:sz w:val="19"/>
-                <w:szCs w:val="19"/>
-              </w:rPr>
-              <w:t xml:space="preserve">Lectura</w:t>
+                <w:rFonts w:ascii="Times New Roman" w:hAnsi="Times New Roman"/>
+              </w:rPr>
+              <w:t>Lectura didáctica</w:t>
             </w:r>
           </w:p>
         </w:tc>
@@ -2128,10 +2085,9 @@
           <w:p>
             <w:r>
               <w:rPr>
-                <w:sz w:val="19"/>
-                <w:szCs w:val="19"/>
-              </w:rPr>
-              <w:t xml:space="preserve">β &lt; 0.8</w:t>
+                <w:rFonts w:ascii="Times New Roman" w:hAnsi="Times New Roman"/>
+              </w:rPr>
+              <w:t>RSI &lt; 30</w:t>
             </w:r>
           </w:p>
         </w:tc>
@@ -2155,10 +2111,9 @@
           <w:p>
             <w:r>
               <w:rPr>
-                <w:sz w:val="19"/>
-                <w:szCs w:val="19"/>
-              </w:rPr>
-              <w:t xml:space="preserve">🟢</w:t>
+                <w:rFonts w:ascii="Times New Roman" w:hAnsi="Times New Roman"/>
+              </w:rPr>
+              <w:t>🔵</w:t>
             </w:r>
           </w:p>
         </w:tc>
@@ -2182,10 +2137,9 @@
           <w:p>
             <w:r>
               <w:rPr>
-                <w:sz w:val="19"/>
-                <w:szCs w:val="19"/>
-              </w:rPr>
-              <w:t xml:space="preserve">Volatilidad baja</w:t>
+                <w:rFonts w:ascii="Times New Roman" w:hAnsi="Times New Roman"/>
+              </w:rPr>
+              <w:t>Posible sobreventa; no es señal automática</w:t>
             </w:r>
           </w:p>
         </w:tc>
@@ -2211,10 +2165,9 @@
           <w:p>
             <w:r>
               <w:rPr>
-                <w:sz w:val="19"/>
-                <w:szCs w:val="19"/>
-              </w:rPr>
-              <w:t xml:space="preserve">0.8 ≤ β ≤ 1.2</w:t>
+                <w:rFonts w:ascii="Times New Roman" w:hAnsi="Times New Roman"/>
+              </w:rPr>
+              <w:t>30 ≤ RSI ≤ 70</w:t>
             </w:r>
           </w:p>
         </w:tc>
@@ -2238,10 +2191,9 @@
           <w:p>
             <w:r>
               <w:rPr>
-                <w:sz w:val="19"/>
-                <w:szCs w:val="19"/>
-              </w:rPr>
-              <w:t xml:space="preserve">🟡</w:t>
+                <w:rFonts w:ascii="Times New Roman" w:hAnsi="Times New Roman"/>
+              </w:rPr>
+              <w:t>🟢</w:t>
             </w:r>
           </w:p>
         </w:tc>
@@ -2265,10 +2217,9 @@
           <w:p>
             <w:r>
               <w:rPr>
-                <w:sz w:val="19"/>
-                <w:szCs w:val="19"/>
-              </w:rPr>
-              <w:t xml:space="preserve">Similar al mercado</w:t>
+                <w:rFonts w:ascii="Times New Roman" w:hAnsi="Times New Roman"/>
+              </w:rPr>
+              <w:t>Zona intermedia</w:t>
             </w:r>
           </w:p>
         </w:tc>
@@ -2294,10 +2245,9 @@
           <w:p>
             <w:r>
               <w:rPr>
-                <w:sz w:val="19"/>
-                <w:szCs w:val="19"/>
-              </w:rPr>
-              <w:t xml:space="preserve">β &gt; 1.2</w:t>
+                <w:rFonts w:ascii="Times New Roman" w:hAnsi="Times New Roman"/>
+              </w:rPr>
+              <w:t>RSI &gt; 70</w:t>
             </w:r>
           </w:p>
         </w:tc>
@@ -2321,10 +2271,9 @@
           <w:p>
             <w:r>
               <w:rPr>
-                <w:sz w:val="19"/>
-                <w:szCs w:val="19"/>
-              </w:rPr>
-              <w:t xml:space="preserve">🔴</w:t>
+                <w:rFonts w:ascii="Times New Roman" w:hAnsi="Times New Roman"/>
+              </w:rPr>
+              <w:t>🟠</w:t>
             </w:r>
           </w:p>
         </w:tc>
@@ -2348,10 +2297,9 @@
           <w:p>
             <w:r>
               <w:rPr>
-                <w:sz w:val="19"/>
-                <w:szCs w:val="19"/>
-              </w:rPr>
-              <w:t xml:space="preserve">Volatilidad alta</w:t>
+                <w:rFonts w:ascii="Times New Roman" w:hAnsi="Times New Roman"/>
+              </w:rPr>
+              <w:t>Posible sobrecompra; no es señal automática</w:t>
             </w:r>
           </w:p>
         </w:tc>
@@ -2368,14 +2316,10 @@
       </w:pPr>
       <w:r>
         <w:rPr>
-          <w:b/>
-          <w:bCs/>
-          <w:color w:val="B45309"/>
-        </w:rPr>
-        <w:t xml:space="preserve">⚠️ Atención: </w:t>
-      </w:r>
-      <w:r>
-        <w:t xml:space="preserve">Estos umbrales son didácticos, no una regla oficial. Y el P/E (precio/utilidad) solo se interpreta comparándolo con empresas del mismo sector.</w:t>
+          <w:rFonts w:ascii="Times New Roman" w:hAnsi="Times New Roman"/>
+          <w:sz w:val="21"/>
+        </w:rPr>
+        <w:t>⚠️ Límite: el dato gratuito usado es un cierre diario histórico, no una cotización en tiempo real. Esta ruta no solicita P/E, beta, noticias ni datos fundamentales premium.</w:t>
       </w:r>
     </w:p>
     <w:p>
@@ -3209,14 +3153,10 @@
       </w:pPr>
       <w:r>
         <w:rPr>
-          <w:b/>
-          <w:bCs/>
-          <w:color w:val="B45309"/>
-        </w:rPr>
-        <w:t xml:space="preserve">⚠️ Atención: </w:t>
-      </w:r>
-      <w:r>
-        <w:t xml:space="preserve">La llave gratuita permite 25 consultas al día y cada análisis gasta hasta 2. Te alcanza para 10 a 12 análisis diarios. No compartas tu llave con otros compañeros.</w:t>
+          <w:rFonts w:ascii="Times New Roman" w:hAnsi="Times New Roman"/>
+          <w:sz w:val="21"/>
+        </w:rPr>
+        <w:t>⚠️ Atención: La llave gratuita permite normalmente 25 consultas al día y cada análisis usa 1 consulta TIME_SERIES_DAILY. La disponibilidad y las cuotas pueden cambiar; revisa siempre la documentación oficial. No compartas tu llave.</w:t>
       </w:r>
     </w:p>
     <w:p>
@@ -4553,14 +4493,10 @@
       </w:pPr>
       <w:r>
         <w:rPr>
-          <w:b/>
-          <w:bCs/>
-          <w:color w:val="0F766E"/>
-        </w:rPr>
-        <w:t xml:space="preserve">✅ Deberías ver: </w:t>
-      </w:r>
-      <w:r>
-        <w:t xml:space="preserve">tres avisos (uno por agente), las dos entregas y la nota final. La ficha debe decir “fuente”: “Alpha Vantage vía MCP” y listar herramientas usadas. Toma captura (Evidencia 2).</w:t>
+          <w:rFonts w:ascii="Times New Roman" w:hAnsi="Times New Roman"/>
+          <w:sz w:val="21"/>
+        </w:rPr>
+        <w:t>✅ Deberías ver: tres avisos, las dos entregas y la nota final. La ficha debe indicar “TIME_SERIES_DAILY compact”, una fecha de dato y esa herramienta MCP. Toma captura (Evidencia 2).</w:t>
       </w:r>
     </w:p>
     <w:p>
@@ -5292,37 +5228,11 @@
         <w:spacing w:after="120"/>
       </w:pPr>
       <w:r>
-        <w:t xml:space="preserve">El archivo </w:t>
-      </w:r>
-      <w:r>
-        <w:rPr>
-          <w:rFonts w:ascii="Consolas" w:cs="Consolas" w:eastAsia="Consolas" w:hAnsi="Consolas"/>
-          <w:color w:val="0E6F7A"/>
-        </w:rPr>
-        <w:t xml:space="preserve">.mcp.json</w:t>
-      </w:r>
-      <w:r>
-        <w:t xml:space="preserve"> conecta Claude Code con el mismo servidor de Alpha Vantage. Define la variable </w:t>
-      </w:r>
-      <w:r>
-        <w:rPr>
-          <w:rFonts w:ascii="Consolas" w:cs="Consolas" w:eastAsia="Consolas" w:hAnsi="Consolas"/>
-          <w:color w:val="0E6F7A"/>
-        </w:rPr>
-        <w:t xml:space="preserve">ALPHAVANTAGE_API_KEY</w:t>
-      </w:r>
-      <w:r>
-        <w:t xml:space="preserve"> en tu terminal, abre Claude Code, aprueba el servidor </w:t>
-      </w:r>
-      <w:r>
-        <w:rPr>
-          <w:b/>
-          <w:bCs/>
-        </w:rPr>
-        <w:t xml:space="preserve">alphavantage</w:t>
-      </w:r>
-      <w:r>
-        <w:t xml:space="preserve"> cuando lo pregunte y escribe: “Con Alpha Vantage, dame la cotización de IBM”. Compara la respuesta con la ficha de Iris.</w:t>
+        <w:rPr>
+          <w:rFonts w:ascii="Times New Roman" w:hAnsi="Times New Roman"/>
+          <w:sz w:val="21"/>
+        </w:rPr>
+        <w:t>El archivo .mcp.json conecta Claude Code con el mismo servidor de Alpha Vantage. Conserva la variable ALPHAVANTAGE_API_KEY y pide: “Con TIME_SERIES_DAILY compact, obtén la serie histórica de IBM; no la llames cotización en tiempo real”. Compara la respuesta con la ficha de Iris.</w:t>
       </w:r>
     </w:p>
     <w:p>
@@ -5890,24 +5800,10 @@
       </w:pPr>
       <w:r>
         <w:rPr>
-          <w:b/>
-          <w:bCs/>
-          <w:color w:val="0F766E"/>
-        </w:rPr>
-        <w:t xml:space="preserve">✅ Deberías ver: </w:t>
-      </w:r>
-      <w:r>
-        <w:t xml:space="preserve">VS Code en el navegador y, en la terminal de abajo, </w:t>
-      </w:r>
-      <w:r>
-        <w:rPr>
-          <w:rFonts w:ascii="Consolas" w:cs="Consolas" w:eastAsia="Consolas" w:hAnsi="Consolas"/>
-          <w:color w:val="0E6F7A"/>
-        </w:rPr>
-        <w:t xml:space="preserve">20 passed</w:t>
-      </w:r>
-      <w:r>
-        <w:t xml:space="preserve"> seguido del estado de tus llaves (✅ o ⬜).</w:t>
+          <w:rFonts w:ascii="Times New Roman" w:hAnsi="Times New Roman"/>
+          <w:sz w:val="21"/>
+        </w:rPr>
+        <w:t>✅ Deberías ver: VS Code en el navegador y, en la terminal, 27 passed seguido del estado de tus llaves (✅ o ⬜).</w:t>
       </w:r>
     </w:p>
     <w:p>
@@ -5943,17 +5839,11 @@
         <w:spacing w:after="80"/>
       </w:pPr>
       <w:r>
-        <w:t xml:space="preserve">Ahora en modo real: </w:t>
-      </w:r>
-      <w:r>
-        <w:rPr>
-          <w:rFonts w:ascii="Consolas" w:cs="Consolas" w:eastAsia="Consolas" w:hAnsi="Consolas"/>
-          <w:color w:val="0E6F7A"/>
-        </w:rPr>
-        <w:t xml:space="preserve">python analizar.py AAPL</w:t>
-      </w:r>
-      <w:r>
-        <w:t xml:space="preserve">. Confirma que la fuente diga “Alpha Vantage vía MCP”.</w:t>
+        <w:rPr>
+          <w:rFonts w:ascii="Times New Roman" w:hAnsi="Times New Roman"/>
+          <w:sz w:val="21"/>
+        </w:rPr>
+        <w:t>Ahora en modo real: python analizar.py AAPL. Confirma que la fuente diga “Alpha Vantage TIME_SERIES_DAILY compact vía MCP (datos gratuitos)”.</w:t>
       </w:r>
     </w:p>
     <w:p>
@@ -6628,7 +6518,11 @@
         <w:spacing w:after="80"/>
       </w:pPr>
       <w:r>
-        <w:t xml:space="preserve">Evidencia 2: el chat de Telegram con un análisis real (fuente: Alpha Vantage vía MCP).</w:t>
+        <w:rPr>
+          <w:rFonts w:ascii="Times New Roman" w:hAnsi="Times New Roman"/>
+          <w:sz w:val="21"/>
+        </w:rPr>
+        <w:t>Evidencia 2: el chat de Telegram con un análisis real, fecha del dato, fuente TIME_SERIES_DAILY compact y herramienta MCP usada.</w:t>
       </w:r>
     </w:p>
     <w:p>
@@ -7708,7 +7602,11 @@
         <w:spacing w:after="60"/>
       </w:pPr>
       <w:r>
-        <w:t xml:space="preserve">☐ En modo real, la fuente es “Alpha Vantage vía MCP”.</w:t>
+        <w:rPr>
+          <w:rFonts w:ascii="Times New Roman" w:hAnsi="Times New Roman"/>
+          <w:sz w:val="21"/>
+        </w:rPr>
+        <w:t>☐ En modo real, la fuente es “Alpha Vantage TIME_SERIES_DAILY compact vía MCP (datos gratuitos)”.</w:t>
       </w:r>
     </w:p>
     <w:p>

</xml_diff>

<commit_message>
Documenta validación real de Alpha Vantage
</commit_message>
<xml_diff>
--- a/docs/01_Guia_del_estudiante.docx
+++ b/docs/01_Guia_del_estudiante.docx
@@ -3156,7 +3156,7 @@
           <w:rFonts w:ascii="Times New Roman" w:hAnsi="Times New Roman"/>
           <w:sz w:val="21"/>
         </w:rPr>
-        <w:t>⚠️ Atención: La llave gratuita permite normalmente 25 consultas al día y cada análisis usa 1 consulta TIME_SERIES_DAILY. La disponibilidad y las cuotas pueden cambiar; revisa siempre la documentación oficial. No compartas tu llave.</w:t>
+        <w:t>⚠️ Atención: La llave gratuita permite normalmente 25 solicitudes al día. El análisis usa una consulta; si el MCP no entrega la serie, el respaldo HTTPS puede requerir una segunda. La cuota puede cambiar: revisa la documentación oficial. No compartas tu llave.</w:t>
       </w:r>
     </w:p>
     <w:p>
@@ -4496,7 +4496,7 @@
           <w:rFonts w:ascii="Times New Roman" w:hAnsi="Times New Roman"/>
           <w:sz w:val="21"/>
         </w:rPr>
-        <w:t>✅ Deberías ver: tres avisos, las dos entregas y la nota final. La ficha debe indicar “TIME_SERIES_DAILY compact”, una fecha de dato y esa herramienta MCP. Toma captura (Evidencia 2).</w:t>
+        <w:t>✅ Deberías ver: tres avisos, las dos entregas y la nota final. La ficha debe indicar TIME_SERIES_DAILY compact, una fecha y el canal usado (MCP o respaldo REST). Toma captura (Evidencia 2).</w:t>
       </w:r>
     </w:p>
     <w:p>
@@ -5843,7 +5843,7 @@
           <w:rFonts w:ascii="Times New Roman" w:hAnsi="Times New Roman"/>
           <w:sz w:val="21"/>
         </w:rPr>
-        <w:t>Ahora en modo real: python analizar.py AAPL. Confirma que la fuente diga “Alpha Vantage TIME_SERIES_DAILY compact vía MCP (datos gratuitos)”.</w:t>
+        <w:t>Ahora en modo real: python analizar.py AAPL. Confirma la fuente TIME_SERIES_DAILY compact, el canal MCP o REST y una fecha real. Si Alpha Vantage falla, el análisis debe detenerse sin sustituir cifras DEMO.</w:t>
       </w:r>
     </w:p>
     <w:p>
@@ -6522,7 +6522,7 @@
           <w:rFonts w:ascii="Times New Roman" w:hAnsi="Times New Roman"/>
           <w:sz w:val="21"/>
         </w:rPr>
-        <w:t>Evidencia 2: el chat de Telegram con un análisis real, fecha del dato, fuente TIME_SERIES_DAILY compact y herramienta MCP usada.</w:t>
+        <w:t>Evidencia 2: el chat de Telegram con un análisis real, fecha del dato, fuente TIME_SERIES_DAILY compact y canal de datos identificado.</w:t>
       </w:r>
     </w:p>
     <w:p>
@@ -7606,7 +7606,7 @@
           <w:rFonts w:ascii="Times New Roman" w:hAnsi="Times New Roman"/>
           <w:sz w:val="21"/>
         </w:rPr>
-        <w:t>☐ En modo real, la fuente es “Alpha Vantage TIME_SERIES_DAILY compact vía MCP (datos gratuitos)”.</w:t>
+        <w:t>☐ En modo real, la fuente es TIME_SERIES_DAILY compact, aparece una fecha y el dato no se presenta como tiempo real.</w:t>
       </w:r>
     </w:p>
     <w:p>
@@ -7902,7 +7902,11 @@
         <w:spacing w:after="120"/>
       </w:pPr>
       <w:r>
-        <w:t xml:space="preserve">Fechas de consulta: 13 de octubre de 2026. Las plataformas cambian con frecuencia; verifica antes de cada generación del diplomado.</w:t>
+        <w:rPr>
+          <w:rFonts w:ascii="Times New Roman" w:hAnsi="Times New Roman"/>
+          <w:sz w:val="21"/>
+        </w:rPr>
+        <w:t>Fechas de consulta y validación: 21 de octubre de 2026. Las plataformas cambian con frecuencia; verifica antes de cada generación del diplomado.</w:t>
       </w:r>
     </w:p>
     <w:sectPr>

</xml_diff>